<commit_message>
republish: regen manuscript.docx with fixed converter (italic spans, 0 stray asterisks)
</commit_message>
<xml_diff>
--- a/publishing/manuscript.docx
+++ b/publishing/manuscript.docx
@@ -9624,23 +9624,41 @@
           <w:i w:val="0"/>
           <w:sz w:val="22"/>
         </w:rPr>
-        <w:t>I wound the tape in. The case took it with that small clean rattle, ten honest feet of steel that had told me the truth and couldn't tell me what to do with the truth. I copied my figures onto the back of the plan, under the warm-room note I had made the first night, and beneath them I wrote one line: *Room 14 ft 2.</w:t>
-      </w:r>
-    </w:p>
-    <w:p>
-      <w:pPr>
-        <w:spacing w:before="0" w:after="240"/>
-        <w:ind w:firstLine="0"/>
-        <w:jc w:val="both"/>
-      </w:pPr>
-      <w:r>
-        <w:rPr>
-          <w:rFonts w:ascii="Garamond" w:hAnsi="Garamond"/>
-          <w:b w:val="0"/>
-          <w:i w:val="0"/>
-          <w:sz w:val="22"/>
-        </w:rPr>
-        <w:t>Wall 9 ft. Window stands 5 ft proud of a wall it sits flush in.* I didn't underline it. There was no need. Underlining is for a thing you might come back and doubt, and I wouldn't be doubting this.</w:t>
+        <w:t xml:space="preserve">I wound the tape in. The case took it with that small clean rattle, ten honest feet of steel that had told me the truth and couldn't tell me what to do with the truth. I copied my figures onto the back of the plan, under the warm-room note I had made the first night, and beneath them I wrote one line: </w:t>
+      </w:r>
+      <w:r>
+        <w:rPr>
+          <w:rFonts w:ascii="Garamond" w:hAnsi="Garamond"/>
+          <w:b w:val="0"/>
+          <w:i/>
+          <w:sz w:val="22"/>
+        </w:rPr>
+        <w:t>Room 14 ft 2.</w:t>
+      </w:r>
+    </w:p>
+    <w:p>
+      <w:pPr>
+        <w:spacing w:before="0" w:after="240"/>
+        <w:ind w:firstLine="0" w:left="360"/>
+        <w:jc w:val="left"/>
+      </w:pPr>
+      <w:r>
+        <w:rPr>
+          <w:rFonts w:ascii="Garamond" w:hAnsi="Garamond"/>
+          <w:b w:val="0"/>
+          <w:i/>
+          <w:sz w:val="22"/>
+        </w:rPr>
+        <w:t>Wall 9 ft. Window stands 5 ft proud of a wall it sits flush in.</w:t>
+      </w:r>
+      <w:r>
+        <w:rPr>
+          <w:rFonts w:ascii="Garamond" w:hAnsi="Garamond"/>
+          <w:b w:val="0"/>
+          <w:i w:val="0"/>
+          <w:sz w:val="22"/>
+        </w:rPr>
+        <w:t xml:space="preserve"> I didn't underline it. There was no need. Underlining is for a thing you might come back and doubt, and I wouldn't be doubting this.</w:t>
       </w:r>
     </w:p>
     <w:p>
@@ -13569,42 +13587,10 @@
         <w:rPr>
           <w:rFonts w:ascii="Garamond" w:hAnsi="Garamond"/>
           <w:b w:val="0"/>
-          <w:i w:val="0"/>
-          <w:sz w:val="22"/>
-        </w:rPr>
-        <w:t>*The tally came up wanting one. I have until the frost. I am to give it a name. I have looked at the parish and the lanes and there is no one come this year, no tramp, no lodger, no one settled near enough.</w:t>
-      </w:r>
-    </w:p>
-    <w:p>
-      <w:pPr>
-        <w:spacing w:before="0" w:after="240"/>
-        <w:ind w:firstLine="0"/>
-        <w:jc w:val="both"/>
-      </w:pPr>
-      <w:r>
-        <w:rPr>
-          <w:rFonts w:ascii="Garamond" w:hAnsi="Garamond"/>
-          <w:b w:val="0"/>
-          <w:i w:val="0"/>
-          <w:sz w:val="22"/>
-        </w:rPr>
-        <w:t>There are the two children at Coldmere for the fortnight. The boy is seven. He goes to the grounds in the mornings. I have only to leave the gate to the pond unlatched and turn away, as one turns from a thing one does not wish to see done.*</w:t>
-      </w:r>
-    </w:p>
-    <w:p>
-      <w:pPr>
-        <w:spacing w:before="0" w:after="240"/>
-        <w:ind w:firstLine="0"/>
-        <w:jc w:val="both"/>
-      </w:pPr>
-      <w:r>
-        <w:rPr>
-          <w:rFonts w:ascii="Garamond" w:hAnsi="Garamond"/>
-          <w:b w:val="0"/>
-          <w:i w:val="0"/>
-          <w:sz w:val="22"/>
-        </w:rPr>
-        <w:t>I knew the boy. I knew the grounds and the gate and the morning. I had been nine years old and reading on the bank.</w:t>
+          <w:i/>
+          <w:sz w:val="22"/>
+        </w:rPr>
+        <w:t>The tally came up wanting one. I have until the frost. I am to give it a name. I have looked at the parish and the lanes and there is no one come this year, no tramp, no lodger, no one settled near enough.</w:t>
       </w:r>
     </w:p>
     <w:p>
@@ -13620,234 +13606,23 @@
           <w:i/>
           <w:sz w:val="22"/>
         </w:rPr>
-        <w:t>I will not write the rest until it is done,</w:t>
-      </w:r>
-      <w:r>
-        <w:rPr>
-          <w:rFonts w:ascii="Garamond" w:hAnsi="Garamond"/>
-          <w:b w:val="0"/>
-          <w:i w:val="0"/>
-          <w:sz w:val="22"/>
-        </w:rPr>
-        <w:t xml:space="preserve"> the entry ended, </w:t>
-      </w:r>
-      <w:r>
-        <w:rPr>
-          <w:rFonts w:ascii="Garamond" w:hAnsi="Garamond"/>
-          <w:b w:val="0"/>
-          <w:i/>
-          <w:sz w:val="22"/>
-        </w:rPr>
-        <w:t>for to set it down before is to do it twice.</w:t>
-      </w:r>
-    </w:p>
-    <w:p>
-      <w:pPr>
-        <w:spacing w:before="0" w:after="240"/>
-        <w:ind w:firstLine="0"/>
-        <w:jc w:val="both"/>
-      </w:pPr>
-      <w:r>
-        <w:rPr>
-          <w:rFonts w:ascii="Garamond" w:hAnsi="Garamond"/>
-          <w:b w:val="0"/>
-          <w:i w:val="0"/>
-          <w:sz w:val="22"/>
-        </w:rPr>
-        <w:t xml:space="preserve">Beneath it stood Danny's: his name, the year, </w:t>
-      </w:r>
-      <w:r>
-        <w:rPr>
-          <w:rFonts w:ascii="Garamond" w:hAnsi="Garamond"/>
-          <w:b w:val="0"/>
-          <w:i/>
-          <w:sz w:val="22"/>
-        </w:rPr>
-        <w:t>Kept on,</w:t>
-      </w:r>
-      <w:r>
-        <w:rPr>
-          <w:rFonts w:ascii="Garamond" w:hAnsi="Garamond"/>
-          <w:b w:val="0"/>
-          <w:i w:val="0"/>
-          <w:sz w:val="22"/>
-        </w:rPr>
-        <w:t xml:space="preserve"> and in the margin the four words she gave them all, </w:t>
-      </w:r>
-      <w:r>
-        <w:rPr>
-          <w:rFonts w:ascii="Garamond" w:hAnsi="Garamond"/>
-          <w:b w:val="0"/>
-          <w:i/>
-          <w:sz w:val="22"/>
-        </w:rPr>
-        <w:t>the room was warm.</w:t>
-      </w:r>
-      <w:r>
-        <w:rPr>
-          <w:rFonts w:ascii="Garamond" w:hAnsi="Garamond"/>
-          <w:b w:val="0"/>
-          <w:i w:val="0"/>
-          <w:sz w:val="22"/>
-        </w:rPr>
-        <w:t xml:space="preserve"> No prose around it. She had kept her word to herself. She hadn't written the rest until it was done, and when it was done she had set down only the column, the clean column, the name and the year and the one word, as she'd entered a hundred before him. As I tag a lot when the thing is sealed and there is nothing left to say of it but its condition.</w:t>
-      </w:r>
-    </w:p>
-    <w:p>
-      <w:pPr>
-        <w:spacing w:before="0" w:after="240"/>
-        <w:ind w:firstLine="0"/>
-        <w:jc w:val="both"/>
-      </w:pPr>
-      <w:r>
-        <w:rPr>
-          <w:rFonts w:ascii="Garamond" w:hAnsi="Garamond"/>
-          <w:b w:val="0"/>
-          <w:i w:val="0"/>
-          <w:sz w:val="22"/>
-        </w:rPr>
-        <w:t>What I felt, the catalog has no column for, and I will not reach for the conservator's word.</w:t>
-      </w:r>
-    </w:p>
-    <w:p>
-      <w:pPr>
-        <w:spacing w:before="0" w:after="240"/>
-        <w:ind w:firstLine="0"/>
-        <w:jc w:val="both"/>
-      </w:pPr>
-      <w:r>
-        <w:rPr>
-          <w:rFonts w:ascii="Garamond" w:hAnsi="Garamond"/>
-          <w:b w:val="0"/>
-          <w:i w:val="0"/>
-          <w:sz w:val="22"/>
-        </w:rPr>
-        <w:t>It was not forgiveness. She had unlatched a gate to keep her own name out of this record, and gone on knowing it thirty years while the boy's room stayed made up at the close of the passage. There is no word in my trade or any other that makes that a thing a person does and stays whole. She did it. The doing is hers.</w:t>
-      </w:r>
-    </w:p>
-    <w:p>
-      <w:pPr>
-        <w:spacing w:before="0" w:after="240"/>
-        <w:ind w:firstLine="0"/>
-        <w:jc w:val="both"/>
-      </w:pPr>
-      <w:r>
-        <w:rPr>
-          <w:rFonts w:ascii="Garamond" w:hAnsi="Garamond"/>
-          <w:b w:val="0"/>
-          <w:i w:val="0"/>
-          <w:sz w:val="22"/>
-        </w:rPr>
-        <w:t>But I read the prose she'd crowded into the margins of fifty years, and I saw what I hadn't let myself see in the clean columns, which was the cost of the cleanness.</w:t>
-      </w:r>
-    </w:p>
-    <w:p>
-      <w:pPr>
-        <w:spacing w:before="0" w:after="240"/>
-        <w:ind w:firstLine="0"/>
-        <w:jc w:val="both"/>
-      </w:pPr>
-      <w:r>
-        <w:rPr>
-          <w:rFonts w:ascii="Garamond" w:hAnsi="Garamond"/>
-          <w:b w:val="0"/>
-          <w:i/>
-          <w:sz w:val="22"/>
-        </w:rPr>
-        <w:t>I think on them now.</w:t>
-      </w:r>
-      <w:r>
-        <w:rPr>
-          <w:rFonts w:ascii="Garamond" w:hAnsi="Garamond"/>
-          <w:b w:val="0"/>
-          <w:i w:val="0"/>
-          <w:sz w:val="22"/>
-        </w:rPr>
-        <w:t xml:space="preserve"> A woman who had not used to think on the names had begun to, late, when the thinking could change nothing. </w:t>
-      </w:r>
-      <w:r>
-        <w:rPr>
-          <w:rFonts w:ascii="Garamond" w:hAnsi="Garamond"/>
-          <w:b w:val="0"/>
-          <w:i/>
-          <w:sz w:val="22"/>
-        </w:rPr>
-        <w:t>I am glad of the warmth and ashamed to be glad.</w:t>
-      </w:r>
-      <w:r>
-        <w:rPr>
-          <w:rFonts w:ascii="Garamond" w:hAnsi="Garamond"/>
-          <w:b w:val="0"/>
-          <w:i w:val="0"/>
-          <w:sz w:val="22"/>
-        </w:rPr>
-        <w:t xml:space="preserve"> She had fed a tally to keep her own name out of it, and she had hated the warmth that told her she had fed it well, and she had gone on. That is not a monster. A monster does not write </w:t>
-      </w:r>
-      <w:r>
-        <w:rPr>
-          <w:rFonts w:ascii="Garamond" w:hAnsi="Garamond"/>
-          <w:b w:val="0"/>
-          <w:i/>
-          <w:sz w:val="22"/>
-        </w:rPr>
-        <w:t>ashamed</w:t>
-      </w:r>
-      <w:r>
-        <w:rPr>
-          <w:rFonts w:ascii="Garamond" w:hAnsi="Garamond"/>
-          <w:b w:val="0"/>
-          <w:i w:val="0"/>
-          <w:sz w:val="22"/>
-        </w:rPr>
-        <w:t xml:space="preserve"> in the foot of a page where no one was meant to read.</w:t>
-      </w:r>
-    </w:p>
-    <w:p>
-      <w:pPr>
-        <w:spacing w:before="0" w:after="240"/>
-        <w:ind w:firstLine="0"/>
-        <w:jc w:val="both"/>
-      </w:pPr>
-      <w:r>
-        <w:rPr>
-          <w:rFonts w:ascii="Garamond" w:hAnsi="Garamond"/>
-          <w:b w:val="0"/>
-          <w:i w:val="0"/>
-          <w:sz w:val="22"/>
-        </w:rPr>
-        <w:t>A monster does not keep a boy's room made up. She kept it because she could not bear to clear it, and she could not bear to clear it because she knew exactly what she had cleared him into, and the made-up bed was the one thing she could give him, which was nothing, which was worse than nothing, and she gave it anyway for fifty years.</w:t>
-      </w:r>
-    </w:p>
-    <w:p>
-      <w:pPr>
-        <w:spacing w:before="0" w:after="240"/>
-        <w:ind w:firstLine="0"/>
-        <w:jc w:val="both"/>
-      </w:pPr>
-      <w:r>
-        <w:rPr>
-          <w:rFonts w:ascii="Garamond" w:hAnsi="Garamond"/>
-          <w:b w:val="0"/>
-          <w:i w:val="0"/>
-          <w:sz w:val="22"/>
-        </w:rPr>
-        <w:t>I knew that giving. I have handed a manifest to people who could be given nothing else. I had thought it mercy. She had thought the bed mercy. We were both wrong, and we both went on.</w:t>
-      </w:r>
-    </w:p>
-    <w:p>
-      <w:pPr>
-        <w:spacing w:before="0" w:after="240"/>
-        <w:ind w:firstLine="0"/>
-        <w:jc w:val="both"/>
-      </w:pPr>
-      <w:r>
-        <w:rPr>
-          <w:rFonts w:ascii="Garamond" w:hAnsi="Garamond"/>
-          <w:b w:val="0"/>
-          <w:i w:val="0"/>
-          <w:sz w:val="22"/>
-        </w:rPr>
-        <w:t>There was one entry among the late ones I read twice and carried with me, though I did not know yet where I would carry it.</w:t>
+        <w:t>There are the two children at Coldmere for the fortnight. The boy is seven. He goes to the grounds in the mornings. I have only to leave the gate to the pond unlatched and turn away, as one turns from a thing one does not wish to see done.</w:t>
+      </w:r>
+    </w:p>
+    <w:p>
+      <w:pPr>
+        <w:spacing w:before="0" w:after="240"/>
+        <w:ind w:firstLine="0"/>
+        <w:jc w:val="both"/>
+      </w:pPr>
+      <w:r>
+        <w:rPr>
+          <w:rFonts w:ascii="Garamond" w:hAnsi="Garamond"/>
+          <w:b w:val="0"/>
+          <w:i w:val="0"/>
+          <w:sz w:val="22"/>
+        </w:rPr>
+        <w:t>I knew the boy. I knew the grounds and the gate and the morning. I had been nine years old and reading on the bank.</w:t>
       </w:r>
     </w:p>
     <w:p>
@@ -13863,6 +13638,249 @@
           <w:i/>
           <w:sz w:val="22"/>
         </w:rPr>
+        <w:t>I will not write the rest until it is done,</w:t>
+      </w:r>
+      <w:r>
+        <w:rPr>
+          <w:rFonts w:ascii="Garamond" w:hAnsi="Garamond"/>
+          <w:b w:val="0"/>
+          <w:i w:val="0"/>
+          <w:sz w:val="22"/>
+        </w:rPr>
+        <w:t xml:space="preserve"> the entry ended, </w:t>
+      </w:r>
+      <w:r>
+        <w:rPr>
+          <w:rFonts w:ascii="Garamond" w:hAnsi="Garamond"/>
+          <w:b w:val="0"/>
+          <w:i/>
+          <w:sz w:val="22"/>
+        </w:rPr>
+        <w:t>for to set it down before is to do it twice.</w:t>
+      </w:r>
+    </w:p>
+    <w:p>
+      <w:pPr>
+        <w:spacing w:before="0" w:after="240"/>
+        <w:ind w:firstLine="0"/>
+        <w:jc w:val="both"/>
+      </w:pPr>
+      <w:r>
+        <w:rPr>
+          <w:rFonts w:ascii="Garamond" w:hAnsi="Garamond"/>
+          <w:b w:val="0"/>
+          <w:i w:val="0"/>
+          <w:sz w:val="22"/>
+        </w:rPr>
+        <w:t xml:space="preserve">Beneath it stood Danny's: his name, the year, </w:t>
+      </w:r>
+      <w:r>
+        <w:rPr>
+          <w:rFonts w:ascii="Garamond" w:hAnsi="Garamond"/>
+          <w:b w:val="0"/>
+          <w:i/>
+          <w:sz w:val="22"/>
+        </w:rPr>
+        <w:t>Kept on,</w:t>
+      </w:r>
+      <w:r>
+        <w:rPr>
+          <w:rFonts w:ascii="Garamond" w:hAnsi="Garamond"/>
+          <w:b w:val="0"/>
+          <w:i w:val="0"/>
+          <w:sz w:val="22"/>
+        </w:rPr>
+        <w:t xml:space="preserve"> and in the margin the four words she gave them all, </w:t>
+      </w:r>
+      <w:r>
+        <w:rPr>
+          <w:rFonts w:ascii="Garamond" w:hAnsi="Garamond"/>
+          <w:b w:val="0"/>
+          <w:i/>
+          <w:sz w:val="22"/>
+        </w:rPr>
+        <w:t>the room was warm.</w:t>
+      </w:r>
+      <w:r>
+        <w:rPr>
+          <w:rFonts w:ascii="Garamond" w:hAnsi="Garamond"/>
+          <w:b w:val="0"/>
+          <w:i w:val="0"/>
+          <w:sz w:val="22"/>
+        </w:rPr>
+        <w:t xml:space="preserve"> No prose around it. She had kept her word to herself. She hadn't written the rest until it was done, and when it was done she had set down only the column, the clean column, the name and the year and the one word, as she'd entered a hundred before him. As I tag a lot when the thing is sealed and there is nothing left to say of it but its condition.</w:t>
+      </w:r>
+    </w:p>
+    <w:p>
+      <w:pPr>
+        <w:spacing w:before="0" w:after="240"/>
+        <w:ind w:firstLine="0"/>
+        <w:jc w:val="both"/>
+      </w:pPr>
+      <w:r>
+        <w:rPr>
+          <w:rFonts w:ascii="Garamond" w:hAnsi="Garamond"/>
+          <w:b w:val="0"/>
+          <w:i w:val="0"/>
+          <w:sz w:val="22"/>
+        </w:rPr>
+        <w:t>What I felt, the catalog has no column for, and I will not reach for the conservator's word.</w:t>
+      </w:r>
+    </w:p>
+    <w:p>
+      <w:pPr>
+        <w:spacing w:before="0" w:after="240"/>
+        <w:ind w:firstLine="0"/>
+        <w:jc w:val="both"/>
+      </w:pPr>
+      <w:r>
+        <w:rPr>
+          <w:rFonts w:ascii="Garamond" w:hAnsi="Garamond"/>
+          <w:b w:val="0"/>
+          <w:i w:val="0"/>
+          <w:sz w:val="22"/>
+        </w:rPr>
+        <w:t>It was not forgiveness. She had unlatched a gate to keep her own name out of this record, and gone on knowing it thirty years while the boy's room stayed made up at the close of the passage. There is no word in my trade or any other that makes that a thing a person does and stays whole. She did it. The doing is hers.</w:t>
+      </w:r>
+    </w:p>
+    <w:p>
+      <w:pPr>
+        <w:spacing w:before="0" w:after="240"/>
+        <w:ind w:firstLine="0"/>
+        <w:jc w:val="both"/>
+      </w:pPr>
+      <w:r>
+        <w:rPr>
+          <w:rFonts w:ascii="Garamond" w:hAnsi="Garamond"/>
+          <w:b w:val="0"/>
+          <w:i w:val="0"/>
+          <w:sz w:val="22"/>
+        </w:rPr>
+        <w:t>But I read the prose she'd crowded into the margins of fifty years, and I saw what I hadn't let myself see in the clean columns, which was the cost of the cleanness.</w:t>
+      </w:r>
+    </w:p>
+    <w:p>
+      <w:pPr>
+        <w:spacing w:before="0" w:after="240"/>
+        <w:ind w:firstLine="0"/>
+        <w:jc w:val="both"/>
+      </w:pPr>
+      <w:r>
+        <w:rPr>
+          <w:rFonts w:ascii="Garamond" w:hAnsi="Garamond"/>
+          <w:b w:val="0"/>
+          <w:i/>
+          <w:sz w:val="22"/>
+        </w:rPr>
+        <w:t>I think on them now.</w:t>
+      </w:r>
+      <w:r>
+        <w:rPr>
+          <w:rFonts w:ascii="Garamond" w:hAnsi="Garamond"/>
+          <w:b w:val="0"/>
+          <w:i w:val="0"/>
+          <w:sz w:val="22"/>
+        </w:rPr>
+        <w:t xml:space="preserve"> A woman who had not used to think on the names had begun to, late, when the thinking could change nothing. </w:t>
+      </w:r>
+      <w:r>
+        <w:rPr>
+          <w:rFonts w:ascii="Garamond" w:hAnsi="Garamond"/>
+          <w:b w:val="0"/>
+          <w:i/>
+          <w:sz w:val="22"/>
+        </w:rPr>
+        <w:t>I am glad of the warmth and ashamed to be glad.</w:t>
+      </w:r>
+      <w:r>
+        <w:rPr>
+          <w:rFonts w:ascii="Garamond" w:hAnsi="Garamond"/>
+          <w:b w:val="0"/>
+          <w:i w:val="0"/>
+          <w:sz w:val="22"/>
+        </w:rPr>
+        <w:t xml:space="preserve"> She had fed a tally to keep her own name out of it, and she had hated the warmth that told her she had fed it well, and she had gone on. That is not a monster. A monster does not write </w:t>
+      </w:r>
+      <w:r>
+        <w:rPr>
+          <w:rFonts w:ascii="Garamond" w:hAnsi="Garamond"/>
+          <w:b w:val="0"/>
+          <w:i/>
+          <w:sz w:val="22"/>
+        </w:rPr>
+        <w:t>ashamed</w:t>
+      </w:r>
+      <w:r>
+        <w:rPr>
+          <w:rFonts w:ascii="Garamond" w:hAnsi="Garamond"/>
+          <w:b w:val="0"/>
+          <w:i w:val="0"/>
+          <w:sz w:val="22"/>
+        </w:rPr>
+        <w:t xml:space="preserve"> in the foot of a page where no one was meant to read.</w:t>
+      </w:r>
+    </w:p>
+    <w:p>
+      <w:pPr>
+        <w:spacing w:before="0" w:after="240"/>
+        <w:ind w:firstLine="0"/>
+        <w:jc w:val="both"/>
+      </w:pPr>
+      <w:r>
+        <w:rPr>
+          <w:rFonts w:ascii="Garamond" w:hAnsi="Garamond"/>
+          <w:b w:val="0"/>
+          <w:i w:val="0"/>
+          <w:sz w:val="22"/>
+        </w:rPr>
+        <w:t>A monster does not keep a boy's room made up. She kept it because she could not bear to clear it, and she could not bear to clear it because she knew exactly what she had cleared him into, and the made-up bed was the one thing she could give him, which was nothing, which was worse than nothing, and she gave it anyway for fifty years.</w:t>
+      </w:r>
+    </w:p>
+    <w:p>
+      <w:pPr>
+        <w:spacing w:before="0" w:after="240"/>
+        <w:ind w:firstLine="0"/>
+        <w:jc w:val="both"/>
+      </w:pPr>
+      <w:r>
+        <w:rPr>
+          <w:rFonts w:ascii="Garamond" w:hAnsi="Garamond"/>
+          <w:b w:val="0"/>
+          <w:i w:val="0"/>
+          <w:sz w:val="22"/>
+        </w:rPr>
+        <w:t>I knew that giving. I have handed a manifest to people who could be given nothing else. I had thought it mercy. She had thought the bed mercy. We were both wrong, and we both went on.</w:t>
+      </w:r>
+    </w:p>
+    <w:p>
+      <w:pPr>
+        <w:spacing w:before="0" w:after="240"/>
+        <w:ind w:firstLine="0"/>
+        <w:jc w:val="both"/>
+      </w:pPr>
+      <w:r>
+        <w:rPr>
+          <w:rFonts w:ascii="Garamond" w:hAnsi="Garamond"/>
+          <w:b w:val="0"/>
+          <w:i w:val="0"/>
+          <w:sz w:val="22"/>
+        </w:rPr>
+        <w:t>There was one entry among the late ones I read twice and carried with me, though I did not know yet where I would carry it.</w:t>
+      </w:r>
+    </w:p>
+    <w:p>
+      <w:pPr>
+        <w:spacing w:before="0" w:after="240"/>
+        <w:ind w:firstLine="0" w:left="360"/>
+        <w:jc w:val="left"/>
+      </w:pPr>
+      <w:r>
+        <w:rPr>
+          <w:rFonts w:ascii="Garamond" w:hAnsi="Garamond"/>
+          <w:b w:val="0"/>
+          <w:i/>
+          <w:sz w:val="22"/>
+        </w:rPr>
         <w:t>I thought, the early years, to burn them. To take the volumes to the grate and let the names go up and have done with the keeping. I tried it on a single leaf, a year long settled, to see. The leaf went to ash and the names with it, and by morning the room was warm as ever and the tally short not one. The book is the account and not the holding. Burn it and you have an unwritten house, and an unwritten house keeps the same as a written one. I never burned another. I kept the record true instead, it being the one thing left that was mine to keep.</w:t>
       </w:r>
     </w:p>
@@ -13908,26 +13926,26 @@
         <w:rPr>
           <w:rFonts w:ascii="Garamond" w:hAnsi="Garamond"/>
           <w:b w:val="0"/>
-          <w:i w:val="0"/>
-          <w:sz w:val="22"/>
-        </w:rPr>
-        <w:t>*The tally is short again and I am old. I have given it forty years of names and there is a thing I have not let myself write. The keeper goes into this record. I have known it from the first.</w:t>
-      </w:r>
-    </w:p>
-    <w:p>
-      <w:pPr>
-        <w:spacing w:before="0" w:after="240"/>
-        <w:ind w:firstLine="0"/>
-        <w:jc w:val="both"/>
-      </w:pPr>
-      <w:r>
-        <w:rPr>
-          <w:rFonts w:ascii="Garamond" w:hAnsi="Garamond"/>
-          <w:b w:val="0"/>
-          <w:i w:val="0"/>
-          <w:sz w:val="22"/>
-        </w:rPr>
-        <w:t>When there is no name to give, the name it takes is the one that holds the pen. I have kept my name out by keeping others in. I cannot keep others in much longer. My hand will not.*</w:t>
+          <w:i/>
+          <w:sz w:val="22"/>
+        </w:rPr>
+        <w:t>The tally is short again and I am old. I have given it forty years of names and there is a thing I have not let myself write. The keeper goes into this record. I have known it from the first.</w:t>
+      </w:r>
+    </w:p>
+    <w:p>
+      <w:pPr>
+        <w:spacing w:before="0" w:after="240"/>
+        <w:ind w:firstLine="0" w:left="360"/>
+        <w:jc w:val="left"/>
+      </w:pPr>
+      <w:r>
+        <w:rPr>
+          <w:rFonts w:ascii="Garamond" w:hAnsi="Garamond"/>
+          <w:b w:val="0"/>
+          <w:i/>
+          <w:sz w:val="22"/>
+        </w:rPr>
+        <w:t>When there is no name to give, the name it takes is the one that holds the pen. I have kept my name out by keeping others in. I cannot keep others in much longer. My hand will not.</w:t>
       </w:r>
     </w:p>
     <w:p>

</xml_diff>